<commit_message>
Harden meeting recovery and deployment behavior
</commit_message>
<xml_diff>
--- a/会记_产品介绍_正式版.docx
+++ b/会记_产品介绍_正式版.docx
@@ -370,7 +370,7 @@
           <w:color w:val="17202A"/>
           <w:sz w:val="21"/>
         </w:rPr>
-        <w:t>一套本地优先的实时会议系统：录音中提供低延迟多语言转写，停录后进行高精度精修、说话人重排、翻译、纪要和 To-do-list 生成；录音保存与后台后处理相互独立，任何后处理失败都不影响已保存的音频和快速转写。</w:t>
+        <w:t>一套本地优先的实时会议系统：录音中提供低延迟多语言转写；停录后自动完成高精度 ASR 精修、说话人重排和最终翻译，完成后由用户点击按钮生成纪要，并自动生成 To-do-list。录音保存与后台后处理相互独立，任何后处理失败都不影响已保存的音频和快速转写。</w:t>
       </w:r>
     </w:p>
     <w:p>
@@ -953,7 +953,7 @@
                 <w:color w:val="17202A"/>
                 <w:sz w:val="19"/>
               </w:rPr>
-              <w:t>停录后先完成音频、快速转写和 manifest 落盘，再异步进行精修和纪要；不再把“正在保存”与长时间后处理混为一谈。</w:t>
+              <w:t>停录后先完成音频、快速转写和 manifest 落盘，再异步进行 ASR 精修、说话人重排和最终翻译；三项完成后才开放“生成纪要和 To-do-list”按钮。</w:t>
             </w:r>
           </w:p>
         </w:tc>
@@ -1147,7 +1147,7 @@
           <w:i w:val="0"/>
           <w:color w:val="17202A"/>
         </w:rPr>
-        <w:t>这是产品体验的关键设计。录音状态 recording_state 只表示录音和快速结果是否已经落盘；postprocess 独立展示 ASR 精修、说话人重排、翻译、纪要和 To-do-list 的阶段状态。用户可以在录音已保存后立即查看和下载，后台任务即使排队、失败或需要重试，也不会让会议停留在无限期的“正在保存”。</w:t>
+        <w:t>这是产品体验的关键设计。录音状态 recording_state 只表示录音和快速结果是否已经落盘；postprocess 独立展示 ASR 精修、说话人重排、翻译、纪要和 To-do-list 的阶段状态；前三项自动执行，纪要由用户按钮触发，成功后自动生成 To-do-list。用户可以在录音已保存后立即查看和下载，后台任务即使排队、失败或需要重试，也不会让会议停留在无限期的“正在保存”。</w:t>
       </w:r>
     </w:p>
     <w:p>
@@ -1174,7 +1174,7 @@
           <w:i w:val="0"/>
           <w:color w:val="17202A"/>
         </w:rPr>
-        <w:t>停录后按固定顺序执行：large-v3 ASR 精修 → Resemblyzer 声纹嵌入、能量 VAD 与余弦相似度聚类 → 将说话人时间段与转写句子按重叠比例对齐 → 使用最终文本批量翻译 → 积墨纪要 → To-do-list。实时阶段仅显示匿名“演讲人 1/2/…”，会后按照首次出现顺序稳定编号并原地更新。暂不做实名声纹录入和参与者身份绑定。</w:t>
+        <w:t>停录后自动按固定顺序执行：large-v3 ASR 精修 → Resemblyzer 声纹嵌入、能量 VAD 与余弦相似度聚类 → 将说话人时间段与转写句子按重叠比例对齐 → 使用最终文本批量翻译。自动阶段全部完成后，用户点击按钮生成积墨纪要；纪要原子保存成功后自动生成 To-do-list。实时阶段仅显示匿名“演讲人 1/2/…”，会后按照首次出现顺序稳定编号并原地更新。暂不做实名声纹录入和参与者身份绑定。</w:t>
       </w:r>
     </w:p>
     <w:p>
@@ -1307,7 +1307,7 @@
           <w:color w:val="17202A"/>
           <w:sz w:val="21"/>
         </w:rPr>
-        <w:t>后台后处理：由 postprocess 任务依次执行精修 ASR、Resemblyzer 说话人重排、对齐、翻译、会议纪要和 To-do-list；每一阶段写入持久化检查点。</w:t>
+        <w:t>后台后处理：postprocess 自动执行精修 ASR、Resemblyzer 说话人重排、对齐和最终翻译；全部完成后进入 ready_for_summary。用户点击按钮触发会议纪要，纪要成功后自动触发 To-do-list；每一阶段写入持久化检查点。</w:t>
       </w:r>
     </w:p>
     <w:p>
@@ -1589,7 +1589,7 @@
                 <w:color w:val="17202A"/>
                 <w:sz w:val="18"/>
               </w:rPr>
-              <w:t>queued / running / complete / partial / error</w:t>
+              <w:t>queued / running / ready_for_summary / complete / partial / error</w:t>
             </w:r>
           </w:p>
         </w:tc>
@@ -2419,7 +2419,7 @@
                 <w:color w:val="17202A"/>
                 <w:sz w:val="17"/>
               </w:rPr>
-              <w:t>停录后按“精修→说话人重排→翻译→积墨纪要→To-do”生成，阶段可见、可重试</w:t>
+              <w:t>停录后自动完成“精修→说话人重排→翻译”，用户按钮触发积墨纪要，成功后自动生成 To-do；阶段可见、可重试</w:t>
             </w:r>
           </w:p>
         </w:tc>
@@ -6314,7 +6314,7 @@
                 <w:color w:val="17202A"/>
                 <w:sz w:val="17"/>
               </w:rPr>
-              <w:t>GPU worker/资源锁</w:t>
+              <w:t>GPU 资源锁</w:t>
             </w:r>
           </w:p>
         </w:tc>
@@ -6337,7 +6337,7 @@
                 <w:color w:val="17202A"/>
                 <w:sz w:val="17"/>
               </w:rPr>
-              <w:t>1 个 GPU worker；实时 ASR、large-v3、翻译和 Resemblyzer 共用 1 把 GPU 锁，严格串行</w:t>
+              <w:t>实时 ASR、large-v3、翻译和 Resemblyzer 共用 1 把进程内 GPU 锁，严格串行</w:t>
             </w:r>
           </w:p>
         </w:tc>
@@ -6360,7 +6360,7 @@
                 <w:color w:val="17202A"/>
                 <w:sz w:val="17"/>
               </w:rPr>
-              <w:t>已配置</w:t>
+              <w:t>已实现</w:t>
             </w:r>
           </w:p>
         </w:tc>
@@ -6383,7 +6383,7 @@
                 <w:color w:val="17202A"/>
                 <w:sz w:val="17"/>
               </w:rPr>
-              <w:t>避免 8 GB 显存同时加载导致 OOM；后台后处理可排队。</w:t>
+              <w:t>避免 8 GB 显存同时执行重推理；当前不提供可配置 worker pool 或显存硬配额。</w:t>
             </w:r>
           </w:p>
         </w:tc>
@@ -6431,7 +6431,7 @@
                 <w:color w:val="17202A"/>
                 <w:sz w:val="17"/>
               </w:rPr>
-              <w:t>实时推理 64；精修 16；待处理任务 64</w:t>
+              <w:t>实时推理 64；精修 16</w:t>
             </w:r>
           </w:p>
         </w:tc>
@@ -6477,7 +6477,7 @@
                 <w:color w:val="17202A"/>
                 <w:sz w:val="17"/>
               </w:rPr>
-              <w:t>有界队列防止无界增长；队列满时返回明确排队/拒绝状态。</w:t>
+              <w:t>两条音频处理队列有界；企业任务队列属于扩展能力。</w:t>
             </w:r>
           </w:p>
         </w:tc>
@@ -6713,7 +6713,7 @@
                 <w:color w:val="17202A"/>
                 <w:sz w:val="17"/>
               </w:rPr>
-              <w:t>默认保留 30 天；可关闭音频保存或设置 retention_days=0 关闭自动过期删除</w:t>
+              <w:t>完整会议结果默认保留 30 天；MEETING_KEEP_AUDIO=0 时，音频在精修和说话人重排成功后删除；失败时保留以便重试</w:t>
             </w:r>
           </w:p>
         </w:tc>
@@ -6759,7 +6759,7 @@
                 <w:color w:val="17202A"/>
                 <w:sz w:val="17"/>
               </w:rPr>
-              <w:t>受磁盘容量、企业合规和删除策略影响。</w:t>
+              <w:t>retention_days=0 可关闭自动过期删除；受磁盘容量、企业合规和删除策略影响。</w:t>
             </w:r>
           </w:p>
         </w:tc>
@@ -6901,7 +6901,7 @@
                 <w:color w:val="17202A"/>
                 <w:sz w:val="17"/>
               </w:rPr>
-              <w:t>RTX 5060 Laptop 8 GB / 32 GB RAM；显存预算约 7200 MB</w:t>
+              <w:t>RTX 5060 Laptop 8 GB / 32 GB RAM；重任务串行执行</w:t>
             </w:r>
           </w:p>
         </w:tc>
@@ -6947,7 +6947,7 @@
                 <w:color w:val="17202A"/>
                 <w:sz w:val="17"/>
               </w:rPr>
-              <w:t>更换 GPU 需重选 CUDA/PyTorch wheel 并重新压测。</w:t>
+              <w:t>当前未实施显存硬配额；更换 GPU 需重选 CUDA/PyTorch wheel 并重新压测。</w:t>
             </w:r>
           </w:p>
         </w:tc>
@@ -6977,7 +6977,7 @@
           <w:i w:val="0"/>
           <w:color w:val="17202A"/>
         </w:rPr>
-        <w:t>以下数据以 2026-08-12 本机实际运行环境、代码常量、模型元数据和实际推理结果为准。Whisper 同时列出 refs/main 当前快照大小与本机 HF cache 目录总量；large-v3 目录总量包含旧快照，不把缓存大小当成跨平台下载包大小承诺。OPUS-MT 已下载并转换为项目内 CTranslate2 int8 模型，VAD 也已完成真实加载和推理验证。</w:t>
+        <w:t>以下数据以 2026-08-13 本机实际模型文件、代码常量和模型配置为准。参数量表示模型复杂度，磁盘大小表示当前量化/转换格式的本机占用，两者不能互相替代；不同平台、量化方式和缓存版本会造成文件大小差异。</w:t>
       </w:r>
     </w:p>
     <w:tbl>
@@ -7198,7 +7198,7 @@
                 <w:color w:val="17202A"/>
                 <w:sz w:val="16"/>
               </w:rPr>
-              <w:t>faster-whisper；mobiuslabsgmbh/faster-whisper-large-v3-turbo（large-v3-turbo，809M 参数）</w:t>
+              <w:t>faster-whisper；mobiuslabsgmbh/faster-whisper-large-v3-turbo（large-v3-turbo，约 809M 参数）</w:t>
             </w:r>
           </w:p>
         </w:tc>
@@ -7221,7 +7221,7 @@
                 <w:color w:val="17202A"/>
                 <w:sz w:val="16"/>
               </w:rPr>
-              <w:t>WhisperModel；CUDA 时 int8_float16，CPU 时 int8；transcribe beam_size=1、vad_filter=False、condition_on_previous_text=False；常驻，停止后释放</w:t>
+              <w:t>WhisperModel；CUDA 时 int8_float16，CPU 时 int8；transcribe beam_size=1、vad_filter=False、condition_on_previous_text=False；录音期间常驻，停止后释放</w:t>
             </w:r>
           </w:p>
         </w:tc>
@@ -7244,7 +7244,7 @@
                 <w:color w:val="17202A"/>
                 <w:sz w:val="16"/>
               </w:rPr>
-              <w:t>当前快照 1,621,665,983 B（1.51 GiB）；cache 目录 1,621,667,008 B；已缓存</w:t>
+              <w:t>当前 CTranslate2 快照 1,621,665,983 B（1.51 GiB）；已缓存</w:t>
             </w:r>
           </w:p>
         </w:tc>
@@ -7292,7 +7292,7 @@
                 <w:color w:val="17202A"/>
                 <w:sz w:val="16"/>
               </w:rPr>
-              <w:t>faster-whisper；Systran/faster-whisper-large-v3（large-v3，1,550M 参数）</w:t>
+              <w:t>faster-whisper；Systran/faster-whisper-large-v3（large-v3，约 1,550M 参数）</w:t>
             </w:r>
           </w:p>
         </w:tc>
@@ -7315,7 +7315,7 @@
                 <w:color w:val="17202A"/>
                 <w:sz w:val="16"/>
               </w:rPr>
-              <w:t>CUDA 时 int8_float16、CPU 时 int8；transcribe beam_size=5、vad_filter=False、condition_on_previous_text=False；停录保存后按需加载；与实时 ASR、说话人处理共用 GPU 锁串行</w:t>
+              <w:t>CUDA 时 int8_float16、CPU 时 int8；transcribe beam_size=5、vad_filter=False、condition_on_previous_text=False；停录保存后按需加载；与其他 GPU 阶段串行</w:t>
             </w:r>
           </w:p>
         </w:tc>
@@ -7338,7 +7338,7 @@
                 <w:color w:val="17202A"/>
                 <w:sz w:val="16"/>
               </w:rPr>
-              <w:t>当前快照 3,090,835,702 B（2.88 GiB）；cache 目录 5,229,931,767 B（4.87 GiB，含旧快照）；已缓存</w:t>
+              <w:t>当前 CTranslate2 快照 3,090,835,702 B（2.88 GiB）；已缓存</w:t>
             </w:r>
           </w:p>
         </w:tc>
@@ -7386,7 +7386,7 @@
                 <w:color w:val="17202A"/>
                 <w:sz w:val="16"/>
               </w:rPr>
-              <w:t>FunASR AutoModel；funasr/fsmn-vad（FSMN）</w:t>
+              <w:t>FunASR AutoModel；funasr/fsmn-vad（FSMN，428,738 参数）</w:t>
             </w:r>
           </w:p>
         </w:tc>
@@ -7409,7 +7409,7 @@
                 <w:color w:val="17202A"/>
                 <w:sz w:val="16"/>
               </w:rPr>
-              <w:t>torchaudio 2.11.0+cu128；优先使用 Hugging Face 本地 snapshot；trust_remote_code=True；disable_update=True；CUDA 使用 cuda:0；浏览器输入 16 kHz mono PCM16；预滚动 240 ms、开始 80 ms、静音结束 350 ms、partial 900 ms、单段上限 8 s</w:t>
+              <w:t>16 kHz；80 维 Mel，LFR 后输入维 400；4 层 FSMN；linear 250、projection 128；项目分段参数：预滚动 240 ms、开始 80 ms、静音结束 350 ms、partial 900 ms、单段上限 8 s</w:t>
             </w:r>
           </w:p>
         </w:tc>
@@ -7432,7 +7432,7 @@
                 <w:color w:val="17202A"/>
                 <w:sz w:val="16"/>
               </w:rPr>
-              <w:t>模型已缓存并在 CUDA 上真实加载；17.16 秒测试音频返回 2 个语音区间，VAD 推理约 0.20 秒；状态 ready</w:t>
+              <w:t>模型权重 model.pt 1,721,366 B（1.64 MiB）；完整本机 snapshot 4,024,535 B（3.84 MiB）；ready</w:t>
             </w:r>
           </w:p>
         </w:tc>
@@ -7668,7 +7668,7 @@
                 <w:color w:val="17202A"/>
                 <w:sz w:val="16"/>
               </w:rPr>
-              <w:t>Helsinki-NLP/opus-mt-en-zh、Helsinki-NLP/opus-mt-de-ZH → CTranslate2 int8；SentencePiece</w:t>
+              <w:t>Marian OPUS-MT → CTranslate2 int8；en→zh 77,943,296 参数；de→zh 76,363,776 参数</w:t>
             </w:r>
           </w:p>
         </w:tc>
@@ -7691,7 +7691,7 @@
                 <w:color w:val="17202A"/>
                 <w:sz w:val="16"/>
               </w:rPr>
-              <w:t>Translator compute_type：CUDA int8_float16 / CPU int8；translate_batch beam_size=2、max_decoding_length=384、repetition_penalty=1.05；自动加入 Marian 目标语言标记和 EOS；批量和缓存；状态 ready/pending/not_needed/unsupported/failed</w:t>
+              <w:t>两者均为 d_model=512、encoder 6 层、decoder 6 层；CUDA int8_float16 / CPU int8；beam_size=2、max_decoding_length=384、repetition_penalty=1.05；SentencePiece</w:t>
             </w:r>
           </w:p>
         </w:tc>
@@ -7714,7 +7714,7 @@
                 <w:color w:val="17202A"/>
                 <w:sz w:val="16"/>
               </w:rPr>
-              <w:t>models/opus-mt/en-zh 约 78.73 MiB、de-zh 约 76.92 MiB；model.bin、SentencePiece、metadata 均齐全；en/de 真实翻译冒烟通过</w:t>
+              <w:t>en→zh 82,552,022 B（78.73 MiB）；de→zh 80,656,414 B（76.92 MiB）；均已就绪</w:t>
             </w:r>
           </w:p>
         </w:tc>
@@ -7814,6 +7814,20 @@
         </w:tc>
       </w:tr>
     </w:tbl>
+    <w:p>
+      <w:pPr>
+        <w:pStyle w:val="SmallNote"/>
+      </w:pPr>
+      <w:r>
+        <w:rPr>
+          <w:rFonts w:ascii="Calibri" w:hAnsi="Calibri" w:eastAsia="Microsoft YaHei" w:cs="Microsoft YaHei"/>
+          <w:b w:val="0"/>
+          <w:i w:val="0"/>
+          <w:color w:val="17202A"/>
+        </w:rPr>
+        <w:t>本机必需本地模型合计约 4.56 GiB（按当前快照和项目转换目录求和，不含重复/旧缓存、Python/CUDA 依赖和积墨外部模型）。其中 Whisper 两套 ASR 约占 4.39 GiB，是主要磁盘占用。</w:t>
+      </w:r>
+    </w:p>
     <w:p>
       <w:pPr>
         <w:pStyle w:val="SmallNote"/>
@@ -7839,7 +7853,992 @@
           <w:i w:val="0"/>
           <w:color w:val="17202A"/>
         </w:rPr>
-        <w:t>部署环境（已核对）：Windows 11 家庭版（10.0.26200，x64，31.12 GiB RAM）；Python 3.11.14；FastAPI/Starlette/Uvicorn；faster-whisper 1.2.1；CTranslate2 4.8.1；FunASR 1.4.1；torchaudio 2.11.0+cu128；Resemblyzer 0.1.4；Lingua 2.1.1；SentencePiece 0.2.2；RTX 5060 Laptop GPU 8,151 MiB，驱动 610.88，CUDA 12.8，PyTorch 2.11.0+cu128，1 个 CUDA 设备；默认 MEETING_DEVICE=auto，MEETING_GPU_WORKERS=1，显存预算 7,200 MB，单活跃会议。</w:t>
+        <w:t>部署环境（已核对）：Windows 11 x64；AMD Ryzen AI 7 H 350（8 核 16 线程）；31.12 GiB RAM；RTX 5060 Laptop GPU 8,151 MiB，驱动 610.88；CUDA 12.8 / PyTorch 2.11.0+cu128；Python 3.11.14。默认 MEETING_DEVICE=auto、单活跃会议；GPU 重任务由单进程资源锁串行执行。</w:t>
+      </w:r>
+    </w:p>
+    <w:p>
+      <w:pPr>
+        <w:pStyle w:val="Heading2"/>
+        <w:keepNext/>
+      </w:pPr>
+      <w:r>
+        <w:rPr>
+          <w:rFonts w:ascii="Calibri" w:hAnsi="Calibri" w:eastAsia="Microsoft YaHei" w:cs="Microsoft YaHei"/>
+          <w:b/>
+          <w:color w:val="2E74B5"/>
+          <w:sz w:val="26"/>
+        </w:rPr>
+        <w:t>部署资源配置建议</w:t>
+      </w:r>
+    </w:p>
+    <w:p>
+      <w:pPr/>
+      <w:r>
+        <w:rPr>
+          <w:rFonts w:ascii="Calibri" w:hAnsi="Calibri" w:eastAsia="Microsoft YaHei" w:cs="Microsoft YaHei"/>
+          <w:b w:val="0"/>
+          <w:i w:val="0"/>
+          <w:color w:val="17202A"/>
+        </w:rPr>
+        <w:t>下表按当前单机架构给出部署口径。“已验证基线”是本机实际跑通环境；“最低可运行”只表示能够安装和执行，不代表实时延迟达标；生产发布前仍需使用目标机器和真实中英德混合音频做 30 分钟连续压测。</w:t>
+      </w:r>
+    </w:p>
+    <w:tbl>
+      <w:tblPr>
+        <w:tblW w:type="dxa" w:w="9360"/>
+        <w:jc w:val="left"/>
+        <w:tblLayout w:type="fixed"/>
+        <w:tblLook w:firstColumn="1" w:firstRow="1" w:lastColumn="0" w:lastRow="0" w:noHBand="0" w:noVBand="1" w:val="04A0"/>
+        <w:tblInd w:w="120" w:type="dxa"/>
+        <w:tblBorders>
+          <w:top w:val="single" w:sz="6" w:space="0" w:color="CCD5DF"/>
+          <w:left w:val="single" w:sz="6" w:space="0" w:color="CCD5DF"/>
+          <w:bottom w:val="single" w:sz="6" w:space="0" w:color="CCD5DF"/>
+          <w:right w:val="single" w:sz="6" w:space="0" w:color="CCD5DF"/>
+          <w:insideH w:val="single" w:sz="6" w:space="0" w:color="CCD5DF"/>
+          <w:insideV w:val="single" w:sz="6" w:space="0" w:color="CCD5DF"/>
+        </w:tblBorders>
+      </w:tblPr>
+      <w:tblGrid>
+        <w:gridCol w:w="1300"/>
+        <w:gridCol w:w="2600"/>
+        <w:gridCol w:w="2800"/>
+        <w:gridCol w:w="2660"/>
+      </w:tblGrid>
+      <w:tr>
+        <w:trPr>
+          <w:tblHeader w:val="true"/>
+        </w:trPr>
+        <w:tc>
+          <w:tcPr>
+            <w:tcW w:type="dxa" w:w="1300"/>
+            <w:tcMar>
+              <w:top w:w="90" w:type="dxa"/>
+              <w:bottom w:w="90" w:type="dxa"/>
+              <w:start w:w="120" w:type="dxa"/>
+              <w:end w:w="120" w:type="dxa"/>
+            </w:tcMar>
+            <w:vAlign w:val="center"/>
+            <w:shd w:fill="E8EEF5" w:val="clear"/>
+          </w:tcPr>
+          <w:p>
+            <w:pPr>
+              <w:widowControl/>
+              <w:spacing w:before="0" w:after="0" w:line="259" w:lineRule="auto"/>
+              <w:jc w:val="left"/>
+            </w:pPr>
+            <w:r>
+              <w:rPr>
+                <w:rFonts w:ascii="Calibri" w:hAnsi="Calibri" w:eastAsia="Microsoft YaHei" w:cs="Microsoft YaHei"/>
+                <w:b/>
+                <w:color w:val="0B2545"/>
+                <w:sz w:val="18"/>
+              </w:rPr>
+            </w:r>
+            <w:r>
+              <w:rPr>
+                <w:rFonts w:ascii="Calibri" w:hAnsi="Calibri" w:eastAsia="Microsoft YaHei" w:cs="Microsoft YaHei"/>
+                <w:b/>
+                <w:color w:val="0B2545"/>
+                <w:sz w:val="18"/>
+              </w:rPr>
+              <w:t>资源</w:t>
+            </w:r>
+          </w:p>
+        </w:tc>
+        <w:tc>
+          <w:tcPr>
+            <w:tcW w:type="dxa" w:w="2600"/>
+            <w:tcMar>
+              <w:top w:w="90" w:type="dxa"/>
+              <w:bottom w:w="90" w:type="dxa"/>
+              <w:start w:w="120" w:type="dxa"/>
+              <w:end w:w="120" w:type="dxa"/>
+            </w:tcMar>
+            <w:vAlign w:val="center"/>
+            <w:shd w:fill="E8EEF5" w:val="clear"/>
+          </w:tcPr>
+          <w:p>
+            <w:pPr>
+              <w:widowControl/>
+              <w:spacing w:before="0" w:after="0" w:line="259" w:lineRule="auto"/>
+              <w:jc w:val="left"/>
+            </w:pPr>
+            <w:r>
+              <w:rPr>
+                <w:rFonts w:ascii="Calibri" w:hAnsi="Calibri" w:eastAsia="Microsoft YaHei" w:cs="Microsoft YaHei"/>
+                <w:b/>
+                <w:color w:val="0B2545"/>
+                <w:sz w:val="18"/>
+              </w:rPr>
+            </w:r>
+            <w:r>
+              <w:rPr>
+                <w:rFonts w:ascii="Calibri" w:hAnsi="Calibri" w:eastAsia="Microsoft YaHei" w:cs="Microsoft YaHei"/>
+                <w:b/>
+                <w:color w:val="0B2545"/>
+                <w:sz w:val="18"/>
+              </w:rPr>
+              <w:t>最低可运行（不承诺实时）</w:t>
+            </w:r>
+          </w:p>
+        </w:tc>
+        <w:tc>
+          <w:tcPr>
+            <w:tcW w:type="dxa" w:w="2800"/>
+            <w:tcMar>
+              <w:top w:w="90" w:type="dxa"/>
+              <w:bottom w:w="90" w:type="dxa"/>
+              <w:start w:w="120" w:type="dxa"/>
+              <w:end w:w="120" w:type="dxa"/>
+            </w:tcMar>
+            <w:vAlign w:val="center"/>
+            <w:shd w:fill="E8EEF5" w:val="clear"/>
+          </w:tcPr>
+          <w:p>
+            <w:pPr>
+              <w:widowControl/>
+              <w:spacing w:before="0" w:after="0" w:line="259" w:lineRule="auto"/>
+              <w:jc w:val="left"/>
+            </w:pPr>
+            <w:r>
+              <w:rPr>
+                <w:rFonts w:ascii="Calibri" w:hAnsi="Calibri" w:eastAsia="Microsoft YaHei" w:cs="Microsoft YaHei"/>
+                <w:b/>
+                <w:color w:val="0B2545"/>
+                <w:sz w:val="18"/>
+              </w:rPr>
+            </w:r>
+            <w:r>
+              <w:rPr>
+                <w:rFonts w:ascii="Calibri" w:hAnsi="Calibri" w:eastAsia="Microsoft YaHei" w:cs="Microsoft YaHei"/>
+                <w:b/>
+                <w:color w:val="0B2545"/>
+                <w:sz w:val="18"/>
+              </w:rPr>
+              <w:t>推荐单机生产基线</w:t>
+            </w:r>
+          </w:p>
+        </w:tc>
+        <w:tc>
+          <w:tcPr>
+            <w:tcW w:type="dxa" w:w="2660"/>
+            <w:tcMar>
+              <w:top w:w="90" w:type="dxa"/>
+              <w:bottom w:w="90" w:type="dxa"/>
+              <w:start w:w="120" w:type="dxa"/>
+              <w:end w:w="120" w:type="dxa"/>
+            </w:tcMar>
+            <w:vAlign w:val="center"/>
+            <w:shd w:fill="E8EEF5" w:val="clear"/>
+          </w:tcPr>
+          <w:p>
+            <w:pPr>
+              <w:widowControl/>
+              <w:spacing w:before="0" w:after="0" w:line="259" w:lineRule="auto"/>
+              <w:jc w:val="left"/>
+            </w:pPr>
+            <w:r>
+              <w:rPr>
+                <w:rFonts w:ascii="Calibri" w:hAnsi="Calibri" w:eastAsia="Microsoft YaHei" w:cs="Microsoft YaHei"/>
+                <w:b/>
+                <w:color w:val="0B2545"/>
+                <w:sz w:val="18"/>
+              </w:rPr>
+            </w:r>
+            <w:r>
+              <w:rPr>
+                <w:rFonts w:ascii="Calibri" w:hAnsi="Calibri" w:eastAsia="Microsoft YaHei" w:cs="Microsoft YaHei"/>
+                <w:b/>
+                <w:color w:val="0B2545"/>
+                <w:sz w:val="18"/>
+              </w:rPr>
+              <w:t>已验证本机 / 说明</w:t>
+            </w:r>
+          </w:p>
+        </w:tc>
+      </w:tr>
+      <w:tr>
+        <w:tc>
+          <w:tcPr>
+            <w:tcW w:type="dxa" w:w="1300"/>
+            <w:shd w:fill="FFFFFF" w:val="clear"/>
+          </w:tcPr>
+          <w:p>
+            <w:pPr>
+              <w:widowControl/>
+              <w:spacing w:before="0" w:after="0" w:line="259" w:lineRule="auto"/>
+              <w:jc w:val="left"/>
+            </w:pPr>
+            <w:r/>
+            <w:r>
+              <w:rPr>
+                <w:rFonts w:ascii="Calibri" w:hAnsi="Calibri" w:eastAsia="Microsoft YaHei" w:cs="Microsoft YaHei"/>
+                <w:b w:val="0"/>
+                <w:color w:val="17202A"/>
+                <w:sz w:val="16"/>
+              </w:rPr>
+              <w:t>CPU</w:t>
+            </w:r>
+          </w:p>
+        </w:tc>
+        <w:tc>
+          <w:tcPr>
+            <w:tcW w:type="dxa" w:w="2600"/>
+            <w:shd w:fill="FFFFFF" w:val="clear"/>
+          </w:tcPr>
+          <w:p>
+            <w:pPr>
+              <w:widowControl/>
+              <w:spacing w:before="0" w:after="0" w:line="259" w:lineRule="auto"/>
+              <w:jc w:val="left"/>
+            </w:pPr>
+            <w:r/>
+            <w:r>
+              <w:rPr>
+                <w:rFonts w:ascii="Calibri" w:hAnsi="Calibri" w:eastAsia="Microsoft YaHei" w:cs="Microsoft YaHei"/>
+                <w:b w:val="0"/>
+                <w:color w:val="17202A"/>
+                <w:sz w:val="16"/>
+              </w:rPr>
+              <w:t>x64，至少 4 核 8 线程；CPU 模式可运行，但 large-v3 精修和本地翻译耗时可能明显增加</w:t>
+            </w:r>
+          </w:p>
+        </w:tc>
+        <w:tc>
+          <w:tcPr>
+            <w:tcW w:type="dxa" w:w="2800"/>
+            <w:shd w:fill="FFFFFF" w:val="clear"/>
+          </w:tcPr>
+          <w:p>
+            <w:pPr>
+              <w:widowControl/>
+              <w:spacing w:before="0" w:after="0" w:line="259" w:lineRule="auto"/>
+              <w:jc w:val="left"/>
+            </w:pPr>
+            <w:r/>
+            <w:r>
+              <w:rPr>
+                <w:rFonts w:ascii="Calibri" w:hAnsi="Calibri" w:eastAsia="Microsoft YaHei" w:cs="Microsoft YaHei"/>
+                <w:b w:val="0"/>
+                <w:color w:val="17202A"/>
+                <w:sz w:val="16"/>
+              </w:rPr>
+              <w:t>8 核 16 线程或以上；GPU 推理时 CPU 仍负责 WebSocket、音频编解码、分段、文件与任务调度</w:t>
+            </w:r>
+          </w:p>
+        </w:tc>
+        <w:tc>
+          <w:tcPr>
+            <w:tcW w:type="dxa" w:w="2660"/>
+            <w:shd w:fill="FFFFFF" w:val="clear"/>
+          </w:tcPr>
+          <w:p>
+            <w:pPr>
+              <w:widowControl/>
+              <w:spacing w:before="0" w:after="0" w:line="259" w:lineRule="auto"/>
+              <w:jc w:val="left"/>
+            </w:pPr>
+            <w:r/>
+            <w:r>
+              <w:rPr>
+                <w:rFonts w:ascii="Calibri" w:hAnsi="Calibri" w:eastAsia="Microsoft YaHei" w:cs="Microsoft YaHei"/>
+                <w:b w:val="0"/>
+                <w:color w:val="17202A"/>
+                <w:sz w:val="16"/>
+              </w:rPr>
+              <w:t>AMD Ryzen AI 7 H 350，8 核 16 线程；单活跃会议</w:t>
+            </w:r>
+          </w:p>
+        </w:tc>
+      </w:tr>
+      <w:tr>
+        <w:tc>
+          <w:tcPr>
+            <w:tcW w:type="dxa" w:w="1300"/>
+            <w:shd w:fill="FAFBFC" w:val="clear"/>
+          </w:tcPr>
+          <w:p>
+            <w:pPr>
+              <w:widowControl/>
+              <w:spacing w:before="0" w:after="0" w:line="259" w:lineRule="auto"/>
+              <w:jc w:val="left"/>
+            </w:pPr>
+            <w:r/>
+            <w:r>
+              <w:rPr>
+                <w:rFonts w:ascii="Calibri" w:hAnsi="Calibri" w:eastAsia="Microsoft YaHei" w:cs="Microsoft YaHei"/>
+                <w:b w:val="0"/>
+                <w:color w:val="17202A"/>
+                <w:sz w:val="16"/>
+              </w:rPr>
+              <w:t>系统内存</w:t>
+            </w:r>
+          </w:p>
+        </w:tc>
+        <w:tc>
+          <w:tcPr>
+            <w:tcW w:type="dxa" w:w="2600"/>
+            <w:shd w:fill="FAFBFC" w:val="clear"/>
+          </w:tcPr>
+          <w:p>
+            <w:pPr>
+              <w:widowControl/>
+              <w:spacing w:before="0" w:after="0" w:line="259" w:lineRule="auto"/>
+              <w:jc w:val="left"/>
+            </w:pPr>
+            <w:r/>
+            <w:r>
+              <w:rPr>
+                <w:rFonts w:ascii="Calibri" w:hAnsi="Calibri" w:eastAsia="Microsoft YaHei" w:cs="Microsoft YaHei"/>
+                <w:b w:val="0"/>
+                <w:color w:val="17202A"/>
+                <w:sz w:val="16"/>
+              </w:rPr>
+              <w:t>16 GB；仅适合单会议、低并发和受控测试，需避免同时加载额外模型或大批量任务</w:t>
+            </w:r>
+          </w:p>
+        </w:tc>
+        <w:tc>
+          <w:tcPr>
+            <w:tcW w:type="dxa" w:w="2800"/>
+            <w:shd w:fill="FAFBFC" w:val="clear"/>
+          </w:tcPr>
+          <w:p>
+            <w:pPr>
+              <w:widowControl/>
+              <w:spacing w:before="0" w:after="0" w:line="259" w:lineRule="auto"/>
+              <w:jc w:val="left"/>
+            </w:pPr>
+            <w:r/>
+            <w:r>
+              <w:rPr>
+                <w:rFonts w:ascii="Calibri" w:hAnsi="Calibri" w:eastAsia="Microsoft YaHei" w:cs="Microsoft YaHei"/>
+                <w:b w:val="0"/>
+                <w:color w:val="17202A"/>
+                <w:sz w:val="16"/>
+              </w:rPr>
+              <w:t>32 GB；为两套 Whisper、Python/CUDA 运行时、音频缓存和后处理留出余量</w:t>
+            </w:r>
+          </w:p>
+        </w:tc>
+        <w:tc>
+          <w:tcPr>
+            <w:tcW w:type="dxa" w:w="2660"/>
+            <w:shd w:fill="FAFBFC" w:val="clear"/>
+          </w:tcPr>
+          <w:p>
+            <w:pPr>
+              <w:widowControl/>
+              <w:spacing w:before="0" w:after="0" w:line="259" w:lineRule="auto"/>
+              <w:jc w:val="left"/>
+            </w:pPr>
+            <w:r/>
+            <w:r>
+              <w:rPr>
+                <w:rFonts w:ascii="Calibri" w:hAnsi="Calibri" w:eastAsia="Microsoft YaHei" w:cs="Microsoft YaHei"/>
+                <w:b w:val="0"/>
+                <w:color w:val="17202A"/>
+                <w:sz w:val="16"/>
+              </w:rPr>
+              <w:t>31.12 GiB 可用物理内存；当前单会议基线</w:t>
+            </w:r>
+          </w:p>
+        </w:tc>
+      </w:tr>
+      <w:tr>
+        <w:tc>
+          <w:tcPr>
+            <w:tcW w:type="dxa" w:w="1300"/>
+            <w:shd w:fill="FFFFFF" w:val="clear"/>
+          </w:tcPr>
+          <w:p>
+            <w:pPr>
+              <w:widowControl/>
+              <w:spacing w:before="0" w:after="0" w:line="259" w:lineRule="auto"/>
+              <w:jc w:val="left"/>
+            </w:pPr>
+            <w:r/>
+            <w:r>
+              <w:rPr>
+                <w:rFonts w:ascii="Calibri" w:hAnsi="Calibri" w:eastAsia="Microsoft YaHei" w:cs="Microsoft YaHei"/>
+                <w:b w:val="0"/>
+                <w:color w:val="17202A"/>
+                <w:sz w:val="16"/>
+              </w:rPr>
+              <w:t>GPU</w:t>
+            </w:r>
+          </w:p>
+        </w:tc>
+        <w:tc>
+          <w:tcPr>
+            <w:tcW w:type="dxa" w:w="2600"/>
+            <w:shd w:fill="FFFFFF" w:val="clear"/>
+          </w:tcPr>
+          <w:p>
+            <w:pPr>
+              <w:widowControl/>
+              <w:spacing w:before="0" w:after="0" w:line="259" w:lineRule="auto"/>
+              <w:jc w:val="left"/>
+            </w:pPr>
+            <w:r/>
+            <w:r>
+              <w:rPr>
+                <w:rFonts w:ascii="Calibri" w:hAnsi="Calibri" w:eastAsia="Microsoft YaHei" w:cs="Microsoft YaHei"/>
+                <w:b w:val="0"/>
+                <w:color w:val="17202A"/>
+                <w:sz w:val="16"/>
+              </w:rPr>
+              <w:t>可不配 GPU，使用 CPU int8；功能可运行但不承诺实时体验</w:t>
+            </w:r>
+          </w:p>
+        </w:tc>
+        <w:tc>
+          <w:tcPr>
+            <w:tcW w:type="dxa" w:w="2800"/>
+            <w:shd w:fill="FFFFFF" w:val="clear"/>
+          </w:tcPr>
+          <w:p>
+            <w:pPr>
+              <w:widowControl/>
+              <w:spacing w:before="0" w:after="0" w:line="259" w:lineRule="auto"/>
+              <w:jc w:val="left"/>
+            </w:pPr>
+            <w:r/>
+            <w:r>
+              <w:rPr>
+                <w:rFonts w:ascii="Calibri" w:hAnsi="Calibri" w:eastAsia="Microsoft YaHei" w:cs="Microsoft YaHei"/>
+                <w:b w:val="0"/>
+                <w:color w:val="17202A"/>
+                <w:sz w:val="16"/>
+              </w:rPr>
+              <w:t>NVIDIA CUDA GPU，8 GB 显存或以上；驱动、CUDA 与 PyTorch wheel 必须匹配</w:t>
+            </w:r>
+          </w:p>
+        </w:tc>
+        <w:tc>
+          <w:tcPr>
+            <w:tcW w:type="dxa" w:w="2660"/>
+            <w:shd w:fill="FFFFFF" w:val="clear"/>
+          </w:tcPr>
+          <w:p>
+            <w:pPr>
+              <w:widowControl/>
+              <w:spacing w:before="0" w:after="0" w:line="259" w:lineRule="auto"/>
+              <w:jc w:val="left"/>
+            </w:pPr>
+            <w:r/>
+            <w:r>
+              <w:rPr>
+                <w:rFonts w:ascii="Calibri" w:hAnsi="Calibri" w:eastAsia="Microsoft YaHei" w:cs="Microsoft YaHei"/>
+                <w:b w:val="0"/>
+                <w:color w:val="17202A"/>
+                <w:sz w:val="16"/>
+              </w:rPr>
+              <w:t>RTX 5060 Laptop GPU；CUDA 可用；单进程 GPU 资源锁串行调度</w:t>
+            </w:r>
+          </w:p>
+        </w:tc>
+      </w:tr>
+      <w:tr>
+        <w:tc>
+          <w:tcPr>
+            <w:tcW w:type="dxa" w:w="1300"/>
+            <w:shd w:fill="FAFBFC" w:val="clear"/>
+          </w:tcPr>
+          <w:p>
+            <w:pPr>
+              <w:widowControl/>
+              <w:spacing w:before="0" w:after="0" w:line="259" w:lineRule="auto"/>
+              <w:jc w:val="left"/>
+            </w:pPr>
+            <w:r/>
+            <w:r>
+              <w:rPr>
+                <w:rFonts w:ascii="Calibri" w:hAnsi="Calibri" w:eastAsia="Microsoft YaHei" w:cs="Microsoft YaHei"/>
+                <w:b w:val="0"/>
+                <w:color w:val="17202A"/>
+                <w:sz w:val="16"/>
+              </w:rPr>
+              <w:t>显存</w:t>
+            </w:r>
+          </w:p>
+        </w:tc>
+        <w:tc>
+          <w:tcPr>
+            <w:tcW w:type="dxa" w:w="2600"/>
+            <w:shd w:fill="FAFBFC" w:val="clear"/>
+          </w:tcPr>
+          <w:p>
+            <w:pPr>
+              <w:widowControl/>
+              <w:spacing w:before="0" w:after="0" w:line="259" w:lineRule="auto"/>
+              <w:jc w:val="left"/>
+            </w:pPr>
+            <w:r/>
+            <w:r>
+              <w:rPr>
+                <w:rFonts w:ascii="Calibri" w:hAnsi="Calibri" w:eastAsia="Microsoft YaHei" w:cs="Microsoft YaHei"/>
+                <w:b w:val="0"/>
+                <w:color w:val="17202A"/>
+                <w:sz w:val="16"/>
+              </w:rPr>
+              <w:t>CPU 模式为 0；若启用 CUDA，不建议低于 8 GB</w:t>
+            </w:r>
+          </w:p>
+        </w:tc>
+        <w:tc>
+          <w:tcPr>
+            <w:tcW w:type="dxa" w:w="2800"/>
+            <w:shd w:fill="FAFBFC" w:val="clear"/>
+          </w:tcPr>
+          <w:p>
+            <w:pPr>
+              <w:widowControl/>
+              <w:spacing w:before="0" w:after="0" w:line="259" w:lineRule="auto"/>
+              <w:jc w:val="left"/>
+            </w:pPr>
+            <w:r/>
+            <w:r>
+              <w:rPr>
+                <w:rFonts w:ascii="Calibri" w:hAnsi="Calibri" w:eastAsia="Microsoft YaHei" w:cs="Microsoft YaHei"/>
+                <w:b w:val="0"/>
+                <w:color w:val="17202A"/>
+                <w:sz w:val="16"/>
+              </w:rPr>
+              <w:t>8 GB 级；实时模型停止后释放，再加载 large-v3 精修，避免两套 ASR 同驻留</w:t>
+            </w:r>
+          </w:p>
+        </w:tc>
+        <w:tc>
+          <w:tcPr>
+            <w:tcW w:type="dxa" w:w="2660"/>
+            <w:shd w:fill="FAFBFC" w:val="clear"/>
+          </w:tcPr>
+          <w:p>
+            <w:pPr>
+              <w:widowControl/>
+              <w:spacing w:before="0" w:after="0" w:line="259" w:lineRule="auto"/>
+              <w:jc w:val="left"/>
+            </w:pPr>
+            <w:r/>
+            <w:r>
+              <w:rPr>
+                <w:rFonts w:ascii="Calibri" w:hAnsi="Calibri" w:eastAsia="Microsoft YaHei" w:cs="Microsoft YaHei"/>
+                <w:b w:val="0"/>
+                <w:color w:val="17202A"/>
+                <w:sz w:val="16"/>
+              </w:rPr>
+              <w:t>物理显存 8,151 MiB；当前代码未实现显存硬配额</w:t>
+            </w:r>
+          </w:p>
+        </w:tc>
+      </w:tr>
+      <w:tr>
+        <w:tc>
+          <w:tcPr>
+            <w:tcW w:type="dxa" w:w="1300"/>
+            <w:shd w:fill="FFFFFF" w:val="clear"/>
+          </w:tcPr>
+          <w:p>
+            <w:pPr>
+              <w:widowControl/>
+              <w:spacing w:before="0" w:after="0" w:line="259" w:lineRule="auto"/>
+              <w:jc w:val="left"/>
+            </w:pPr>
+            <w:r/>
+            <w:r>
+              <w:rPr>
+                <w:rFonts w:ascii="Calibri" w:hAnsi="Calibri" w:eastAsia="Microsoft YaHei" w:cs="Microsoft YaHei"/>
+                <w:b w:val="0"/>
+                <w:color w:val="17202A"/>
+                <w:sz w:val="16"/>
+              </w:rPr>
+              <w:t>磁盘</w:t>
+            </w:r>
+          </w:p>
+        </w:tc>
+        <w:tc>
+          <w:tcPr>
+            <w:tcW w:type="dxa" w:w="2600"/>
+            <w:shd w:fill="FFFFFF" w:val="clear"/>
+          </w:tcPr>
+          <w:p>
+            <w:pPr>
+              <w:widowControl/>
+              <w:spacing w:before="0" w:after="0" w:line="259" w:lineRule="auto"/>
+              <w:jc w:val="left"/>
+            </w:pPr>
+            <w:r/>
+            <w:r>
+              <w:rPr>
+                <w:rFonts w:ascii="Calibri" w:hAnsi="Calibri" w:eastAsia="Microsoft YaHei" w:cs="Microsoft YaHei"/>
+                <w:b w:val="0"/>
+                <w:color w:val="17202A"/>
+                <w:sz w:val="16"/>
+              </w:rPr>
+              <w:t>至少预留 15 GB 给程序、Python/CUDA 依赖和当前模型；录音/结果空间另计</w:t>
+            </w:r>
+          </w:p>
+        </w:tc>
+        <w:tc>
+          <w:tcPr>
+            <w:tcW w:type="dxa" w:w="2800"/>
+            <w:shd w:fill="FFFFFF" w:val="clear"/>
+          </w:tcPr>
+          <w:p>
+            <w:pPr>
+              <w:widowControl/>
+              <w:spacing w:before="0" w:after="0" w:line="259" w:lineRule="auto"/>
+              <w:jc w:val="left"/>
+            </w:pPr>
+            <w:r/>
+            <w:r>
+              <w:rPr>
+                <w:rFonts w:ascii="Calibri" w:hAnsi="Calibri" w:eastAsia="Microsoft YaHei" w:cs="Microsoft YaHei"/>
+                <w:b w:val="0"/>
+                <w:color w:val="17202A"/>
+                <w:sz w:val="16"/>
+              </w:rPr>
+              <w:t>建议预留 20 GB 以上系统盘空间，并为 result/meetings 单独规划容量或对象存储</w:t>
+            </w:r>
+          </w:p>
+        </w:tc>
+        <w:tc>
+          <w:tcPr>
+            <w:tcW w:type="dxa" w:w="2660"/>
+            <w:shd w:fill="FFFFFF" w:val="clear"/>
+          </w:tcPr>
+          <w:p>
+            <w:pPr>
+              <w:widowControl/>
+              <w:spacing w:before="0" w:after="0" w:line="259" w:lineRule="auto"/>
+              <w:jc w:val="left"/>
+            </w:pPr>
+            <w:r/>
+            <w:r>
+              <w:rPr>
+                <w:rFonts w:ascii="Calibri" w:hAnsi="Calibri" w:eastAsia="Microsoft YaHei" w:cs="Microsoft YaHei"/>
+                <w:b w:val="0"/>
+                <w:color w:val="17202A"/>
+                <w:sz w:val="16"/>
+              </w:rPr>
+              <w:t>必需模型约 4.56 GiB；当前 .venv 约 5.41 GiB；项目内 OPUS-MT 约 155.65 MiB；旧缓存会额外占用</w:t>
+            </w:r>
+          </w:p>
+        </w:tc>
+      </w:tr>
+      <w:tr>
+        <w:tc>
+          <w:tcPr>
+            <w:tcW w:type="dxa" w:w="1300"/>
+            <w:shd w:fill="FAFBFC" w:val="clear"/>
+          </w:tcPr>
+          <w:p>
+            <w:pPr>
+              <w:widowControl/>
+              <w:spacing w:before="0" w:after="0" w:line="259" w:lineRule="auto"/>
+              <w:jc w:val="left"/>
+            </w:pPr>
+            <w:r/>
+            <w:r>
+              <w:rPr>
+                <w:rFonts w:ascii="Calibri" w:hAnsi="Calibri" w:eastAsia="Microsoft YaHei" w:cs="Microsoft YaHei"/>
+                <w:b w:val="0"/>
+                <w:color w:val="17202A"/>
+                <w:sz w:val="16"/>
+              </w:rPr>
+              <w:t>系统与运行时</w:t>
+            </w:r>
+          </w:p>
+        </w:tc>
+        <w:tc>
+          <w:tcPr>
+            <w:tcW w:type="dxa" w:w="2600"/>
+            <w:shd w:fill="FAFBFC" w:val="clear"/>
+          </w:tcPr>
+          <w:p>
+            <w:pPr>
+              <w:widowControl/>
+              <w:spacing w:before="0" w:after="0" w:line="259" w:lineRule="auto"/>
+              <w:jc w:val="left"/>
+            </w:pPr>
+            <w:r/>
+            <w:r>
+              <w:rPr>
+                <w:rFonts w:ascii="Calibri" w:hAnsi="Calibri" w:eastAsia="Microsoft YaHei" w:cs="Microsoft YaHei"/>
+                <w:b w:val="0"/>
+                <w:color w:val="17202A"/>
+                <w:sz w:val="16"/>
+              </w:rPr>
+              <w:t>Windows 10/11 x64；Python 3.11；Chrome 或 Edge；FFmpeg 建议安装</w:t>
+            </w:r>
+          </w:p>
+        </w:tc>
+        <w:tc>
+          <w:tcPr>
+            <w:tcW w:type="dxa" w:w="2800"/>
+            <w:shd w:fill="FAFBFC" w:val="clear"/>
+          </w:tcPr>
+          <w:p>
+            <w:pPr>
+              <w:widowControl/>
+              <w:spacing w:before="0" w:after="0" w:line="259" w:lineRule="auto"/>
+              <w:jc w:val="left"/>
+            </w:pPr>
+            <w:r/>
+            <w:r>
+              <w:rPr>
+                <w:rFonts w:ascii="Calibri" w:hAnsi="Calibri" w:eastAsia="Microsoft YaHei" w:cs="Microsoft YaHei"/>
+                <w:b w:val="0"/>
+                <w:color w:val="17202A"/>
+                <w:sz w:val="16"/>
+              </w:rPr>
+              <w:t>Windows 11 x64；Python 3.11；CUDA 12.8 对应 PyTorch/torchaudio；生产关闭模型自动下载</w:t>
+            </w:r>
+          </w:p>
+        </w:tc>
+        <w:tc>
+          <w:tcPr>
+            <w:tcW w:type="dxa" w:w="2660"/>
+            <w:shd w:fill="FAFBFC" w:val="clear"/>
+          </w:tcPr>
+          <w:p>
+            <w:pPr>
+              <w:widowControl/>
+              <w:spacing w:before="0" w:after="0" w:line="259" w:lineRule="auto"/>
+              <w:jc w:val="left"/>
+            </w:pPr>
+            <w:r/>
+            <w:r>
+              <w:rPr>
+                <w:rFonts w:ascii="Calibri" w:hAnsi="Calibri" w:eastAsia="Microsoft YaHei" w:cs="Microsoft YaHei"/>
+                <w:b w:val="0"/>
+                <w:color w:val="17202A"/>
+                <w:sz w:val="16"/>
+              </w:rPr>
+              <w:t>Windows 11；Python 3.11.14；CUDA 12.8；PyTorch/torchaudio 2.11.0+cu128</w:t>
+            </w:r>
+          </w:p>
+        </w:tc>
+      </w:tr>
+      <w:tr>
+        <w:tc>
+          <w:tcPr>
+            <w:tcW w:type="dxa" w:w="1300"/>
+            <w:shd w:fill="FFFFFF" w:val="clear"/>
+          </w:tcPr>
+          <w:p>
+            <w:pPr>
+              <w:widowControl/>
+              <w:spacing w:before="0" w:after="0" w:line="259" w:lineRule="auto"/>
+              <w:jc w:val="left"/>
+            </w:pPr>
+            <w:r/>
+            <w:r>
+              <w:rPr>
+                <w:rFonts w:ascii="Calibri" w:hAnsi="Calibri" w:eastAsia="Microsoft YaHei" w:cs="Microsoft YaHei"/>
+                <w:b w:val="0"/>
+                <w:color w:val="17202A"/>
+                <w:sz w:val="16"/>
+              </w:rPr>
+              <w:t>单机并发</w:t>
+            </w:r>
+          </w:p>
+        </w:tc>
+        <w:tc>
+          <w:tcPr>
+            <w:tcW w:type="dxa" w:w="2600"/>
+            <w:shd w:fill="FFFFFF" w:val="clear"/>
+          </w:tcPr>
+          <w:p>
+            <w:pPr>
+              <w:widowControl/>
+              <w:spacing w:before="0" w:after="0" w:line="259" w:lineRule="auto"/>
+              <w:jc w:val="left"/>
+            </w:pPr>
+            <w:r/>
+            <w:r>
+              <w:rPr>
+                <w:rFonts w:ascii="Calibri" w:hAnsi="Calibri" w:eastAsia="Microsoft YaHei" w:cs="Microsoft YaHei"/>
+                <w:b w:val="0"/>
+                <w:color w:val="17202A"/>
+                <w:sz w:val="16"/>
+              </w:rPr>
+              <w:t>1 场；MEETING_MAX_ACTIVE_MEETINGS=1</w:t>
+            </w:r>
+          </w:p>
+        </w:tc>
+        <w:tc>
+          <w:tcPr>
+            <w:tcW w:type="dxa" w:w="2800"/>
+            <w:shd w:fill="FFFFFF" w:val="clear"/>
+          </w:tcPr>
+          <w:p>
+            <w:pPr>
+              <w:widowControl/>
+              <w:spacing w:before="0" w:after="0" w:line="259" w:lineRule="auto"/>
+              <w:jc w:val="left"/>
+            </w:pPr>
+            <w:r/>
+            <w:r>
+              <w:rPr>
+                <w:rFonts w:ascii="Calibri" w:hAnsi="Calibri" w:eastAsia="Microsoft YaHei" w:cs="Microsoft YaHei"/>
+                <w:b w:val="0"/>
+                <w:color w:val="17202A"/>
+                <w:sz w:val="16"/>
+              </w:rPr>
+              <w:t>当前单进程基线 1 场。增加并发前必须压测；不能把 10 路目标理解为单张 8 GB GPU 的承诺</w:t>
+            </w:r>
+          </w:p>
+        </w:tc>
+        <w:tc>
+          <w:tcPr>
+            <w:tcW w:type="dxa" w:w="2660"/>
+            <w:shd w:fill="FFFFFF" w:val="clear"/>
+          </w:tcPr>
+          <w:p>
+            <w:pPr>
+              <w:widowControl/>
+              <w:spacing w:before="0" w:after="0" w:line="259" w:lineRule="auto"/>
+              <w:jc w:val="left"/>
+            </w:pPr>
+            <w:r/>
+            <w:r>
+              <w:rPr>
+                <w:rFonts w:ascii="Calibri" w:hAnsi="Calibri" w:eastAsia="Microsoft YaHei" w:cs="Microsoft YaHei"/>
+                <w:b w:val="0"/>
+                <w:color w:val="17202A"/>
+                <w:sz w:val="16"/>
+              </w:rPr>
+              <w:t>默认 1 场活跃会议；实时与精修队列严格有界</w:t>
+            </w:r>
+          </w:p>
+        </w:tc>
+      </w:tr>
+      <w:tr>
+        <w:tc>
+          <w:tcPr>
+            <w:tcW w:type="dxa" w:w="1300"/>
+            <w:shd w:fill="FAFBFC" w:val="clear"/>
+          </w:tcPr>
+          <w:p>
+            <w:pPr>
+              <w:widowControl/>
+              <w:spacing w:before="0" w:after="0" w:line="259" w:lineRule="auto"/>
+              <w:jc w:val="left"/>
+            </w:pPr>
+            <w:r/>
+            <w:r>
+              <w:rPr>
+                <w:rFonts w:ascii="Calibri" w:hAnsi="Calibri" w:eastAsia="Microsoft YaHei" w:cs="Microsoft YaHei"/>
+                <w:b w:val="0"/>
+                <w:color w:val="17202A"/>
+                <w:sz w:val="16"/>
+              </w:rPr>
+              <w:t>网络</w:t>
+            </w:r>
+          </w:p>
+        </w:tc>
+        <w:tc>
+          <w:tcPr>
+            <w:tcW w:type="dxa" w:w="2600"/>
+            <w:shd w:fill="FAFBFC" w:val="clear"/>
+          </w:tcPr>
+          <w:p>
+            <w:pPr>
+              <w:widowControl/>
+              <w:spacing w:before="0" w:after="0" w:line="259" w:lineRule="auto"/>
+              <w:jc w:val="left"/>
+            </w:pPr>
+            <w:r/>
+            <w:r>
+              <w:rPr>
+                <w:rFonts w:ascii="Calibri" w:hAnsi="Calibri" w:eastAsia="Microsoft YaHei" w:cs="Microsoft YaHei"/>
+                <w:b w:val="0"/>
+                <w:color w:val="17202A"/>
+                <w:sz w:val="16"/>
+              </w:rPr>
+              <w:t>本地 ASR、VAD、翻译和说话人重排可离线；首次准备模型时需要下载</w:t>
+            </w:r>
+          </w:p>
+        </w:tc>
+        <w:tc>
+          <w:tcPr>
+            <w:tcW w:type="dxa" w:w="2800"/>
+            <w:shd w:fill="FAFBFC" w:val="clear"/>
+          </w:tcPr>
+          <w:p>
+            <w:pPr>
+              <w:widowControl/>
+              <w:spacing w:before="0" w:after="0" w:line="259" w:lineRule="auto"/>
+              <w:jc w:val="left"/>
+            </w:pPr>
+            <w:r/>
+            <w:r>
+              <w:rPr>
+                <w:rFonts w:ascii="Calibri" w:hAnsi="Calibri" w:eastAsia="Microsoft YaHei" w:cs="Microsoft YaHei"/>
+                <w:b w:val="0"/>
+                <w:color w:val="17202A"/>
+                <w:sz w:val="16"/>
+              </w:rPr>
+              <w:t>生产预下载并校验所有模型；仅纪要/To-do 使用积墨时需要访问外部 Jimo 节点</w:t>
+            </w:r>
+          </w:p>
+        </w:tc>
+        <w:tc>
+          <w:tcPr>
+            <w:tcW w:type="dxa" w:w="2660"/>
+            <w:shd w:fill="FAFBFC" w:val="clear"/>
+          </w:tcPr>
+          <w:p>
+            <w:pPr>
+              <w:widowControl/>
+              <w:spacing w:before="0" w:after="0" w:line="259" w:lineRule="auto"/>
+              <w:jc w:val="left"/>
+            </w:pPr>
+            <w:r/>
+            <w:r>
+              <w:rPr>
+                <w:rFonts w:ascii="Calibri" w:hAnsi="Calibri" w:eastAsia="Microsoft YaHei" w:cs="Microsoft YaHei"/>
+                <w:b w:val="0"/>
+                <w:color w:val="17202A"/>
+                <w:sz w:val="16"/>
+              </w:rPr>
+              <w:t>生产建议 ASR_AUTODOWNLOAD=0、TRANSLATION_AUTODOWNLOAD=0</w:t>
+            </w:r>
+          </w:p>
+        </w:tc>
+      </w:tr>
+    </w:tbl>
+    <w:p>
+      <w:pPr>
+        <w:spacing w:before="100" w:after="160" w:line="269" w:lineRule="auto"/>
+        <w:ind w:left="144" w:right="144"/>
+        <w:shd w:fill="FFF8E8" w:val="clear"/>
+        <w:pBdr>
+          <w:top w:val="single" w:sz="7" w:space="5" w:color="A56A00"/>
+          <w:left w:val="single" w:sz="7" w:space="5" w:color="A56A00"/>
+          <w:bottom w:val="single" w:sz="7" w:space="5" w:color="A56A00"/>
+          <w:right w:val="single" w:sz="7" w:space="5" w:color="A56A00"/>
+        </w:pBdr>
+      </w:pPr>
+      <w:r>
+        <w:rPr>
+          <w:rFonts w:ascii="Calibri" w:hAnsi="Calibri" w:eastAsia="Microsoft YaHei" w:cs="Microsoft YaHei"/>
+          <w:b/>
+          <w:color w:val="A56A00"/>
+          <w:sz w:val="20"/>
+        </w:rPr>
+        <w:t xml:space="preserve">容量边界  </w:t>
+      </w:r>
+      <w:r>
+        <w:rPr>
+          <w:rFonts w:ascii="Calibri" w:hAnsi="Calibri" w:eastAsia="Microsoft YaHei" w:cs="Microsoft YaHei"/>
+          <w:color w:val="17202A"/>
+          <w:sz w:val="21"/>
+        </w:rPr>
+        <w:t>企业第一阶段可以把 10 路同时会议作为压测目标，但当前单机产品基线仍是 1 路。多路部署应拆分为多个 GPU worker，并使用目标 GPU 测量首结果延迟、P50/P95、RTF、峰值显存、队列深度和恢复时间后再确定安全流数。</w:t>
       </w:r>
     </w:p>
     <w:p>
@@ -8962,7 +9961,7 @@
           <w:color w:val="17202A"/>
           <w:sz w:val="21"/>
         </w:rPr>
-        <w:t>会记是一套本地优先的实时会议工作台，支持中文、英文和德文会议的实时转写与中译。它在录音期间用轻量实时模型帮助参会者跟上讨论，停录后自动用更高质量 ASR 和说话人分离模型完成精修，再生成会议纪要和 To-do-list。与单纯字幕或云端会议机器人不同，会记把录音保存、后台后处理和结果修订拆开，既保留本地数据边界，也让失败可见、任务可重试、结果可追溯。</w:t>
+        <w:t>会记是一套本地优先的实时会议工作台，支持中文、英文和德文会议的实时转写与中译。它在录音期间用轻量实时模型帮助参会者跟上讨论，停录后自动用更高质量 ASR 和说话人分离模型完成精修；精修、重排和翻译全部完成后，用户点击按钮生成会议纪要，随后系统自动生成 To-do-list。与单纯字幕或云端会议机器人不同，会记把录音保存、后台后处理和结果修订拆开，既保留本地数据边界，也让失败可见、任务可重试、结果可追溯。</w:t>
       </w:r>
     </w:p>
     <w:p>
@@ -8989,7 +9988,7 @@
           <w:i w:val="0"/>
           <w:color w:val="17202A"/>
         </w:rPr>
-        <w:t>产品与技术参数依据本仓库的 README.md、DEPLOYMENT.md、pyproject.toml、realtime_meeting/config.py、runtime.py、session.py、storage.py 和已实现的产品能力整理；竞品与模型资料为公开官方页面，访问日期：2026-08-12。公开产品能力可能随版本、地区和套餐变化。</w:t>
+        <w:t>产品与技术参数依据本仓库的 README.md、DEPLOYMENT.md、pyproject.toml、realtime_meeting/config.py、runtime.py、session.py、storage.py 和已实现的产品能力整理；竞品与模型资料为公开官方页面，访问日期：2026-08-13。公开产品能力可能随版本、地区和套餐变化。</w:t>
       </w:r>
     </w:p>
     <w:p>

</xml_diff>